<commit_message>
Clean up history: remove large docker artifacts and apply improvements
</commit_message>
<xml_diff>
--- a/docs/DockerSetup.docx
+++ b/docs/DockerSetup.docx
@@ -4,33 +4,22 @@
   <w:body>
     <w:p>
       <w:pPr>
-        <w:rPr>
-          <w:b/>
-          <w:bCs/>
-        </w:rPr>
-      </w:pPr>
-      <w:r>
-        <w:rPr>
-          <w:b/>
-          <w:bCs/>
-        </w:rPr>
-        <w:t xml:space="preserve">1. Install &amp; Setup </w:t>
-      </w:r>
-      <w:proofErr w:type="spellStart"/>
-      <w:r>
-        <w:rPr>
-          <w:b/>
-          <w:bCs/>
-        </w:rPr>
-        <w:t>Ollama</w:t>
-      </w:r>
-      <w:proofErr w:type="spellEnd"/>
-      <w:r>
-        <w:rPr>
-          <w:b/>
-          <w:bCs/>
-        </w:rPr>
-        <w:t xml:space="preserve"> (AI Models)</w:t>
+        <w:pStyle w:val="Paragraphedeliste"/>
+        <w:numPr>
+          <w:ilvl w:val="0"/>
+          <w:numId w:val="3"/>
+        </w:numPr>
+        <w:rPr>
+          <w:b/>
+          <w:bCs/>
+        </w:rPr>
+      </w:pPr>
+      <w:r>
+        <w:rPr>
+          <w:b/>
+          <w:bCs/>
+        </w:rPr>
+        <w:t>Install &amp; Setup Ollama (AI Models)</w:t>
       </w:r>
       <w:r>
         <w:rPr>
@@ -45,40 +34,21 @@
         <w:rPr>
           <w:b/>
           <w:bCs/>
-        </w:rPr>
-      </w:pPr>
-      <w:r>
-        <w:rPr>
-          <w:b/>
-          <w:bCs/>
-        </w:rPr>
-        <w:t xml:space="preserve">NOT REQUIRED – ONLY IF YOU WANT TO USE LOCAL MODELS (else you can simply connect to </w:t>
-      </w:r>
-      <w:proofErr w:type="spellStart"/>
-      <w:r>
-        <w:rPr>
-          <w:b/>
-          <w:bCs/>
-        </w:rPr>
-        <w:t>OenRouter</w:t>
-      </w:r>
-      <w:proofErr w:type="spellEnd"/>
-      <w:r>
-        <w:rPr>
-          <w:b/>
-          <w:bCs/>
-        </w:rPr>
-        <w:t xml:space="preserve"> or similar)</w:t>
-      </w:r>
-    </w:p>
-    <w:p>
-      <w:proofErr w:type="spellStart"/>
-      <w:r>
-        <w:t>Ollama</w:t>
-      </w:r>
-      <w:proofErr w:type="spellEnd"/>
-      <w:r>
-        <w:t xml:space="preserve"> handles the local LLMs used for chat and analysis.</w:t>
+          <w:color w:val="FF0000"/>
+        </w:rPr>
+      </w:pPr>
+      <w:r>
+        <w:rPr>
+          <w:b/>
+          <w:bCs/>
+          <w:color w:val="FF0000"/>
+        </w:rPr>
+        <w:t>NOT REQUIRED – ONLY IF YOU WANT TO USE LOCAL MODELS (else you can simply connect to OenRouter or similar)</w:t>
+      </w:r>
+    </w:p>
+    <w:p>
+      <w:r>
+        <w:t>Ollama handles the local LLMs used for chat and analysis.</w:t>
       </w:r>
     </w:p>
     <w:p>
@@ -125,15 +95,7 @@
         <w:t>Install</w:t>
       </w:r>
       <w:r>
-        <w:t xml:space="preserve">: Run the installer and ensure the </w:t>
-      </w:r>
-      <w:proofErr w:type="spellStart"/>
-      <w:r>
-        <w:t>Ollama</w:t>
-      </w:r>
-      <w:proofErr w:type="spellEnd"/>
-      <w:r>
-        <w:t xml:space="preserve"> icon appears in your system tray.</w:t>
+        <w:t>: Run the installer and ensure the Ollama icon appears in your system tray.</w:t>
       </w:r>
     </w:p>
     <w:p>
@@ -178,14 +140,12 @@
           <w:rFonts w:ascii="Courier New" w:hAnsi="Courier New" w:cs="Courier New"/>
         </w:rPr>
       </w:pPr>
-      <w:proofErr w:type="spellStart"/>
       <w:r>
         <w:rPr>
           <w:rFonts w:ascii="Courier New" w:hAnsi="Courier New" w:cs="Courier New"/>
         </w:rPr>
         <w:t>powershell</w:t>
       </w:r>
-      <w:proofErr w:type="spellEnd"/>
     </w:p>
     <w:p>
       <w:pPr>
@@ -200,19 +160,11 @@
           <w:rFonts w:ascii="Courier New" w:hAnsi="Courier New" w:cs="Courier New"/>
         </w:rPr>
       </w:pPr>
-      <w:proofErr w:type="spellStart"/>
-      <w:r>
-        <w:rPr>
-          <w:rFonts w:ascii="Courier New" w:hAnsi="Courier New" w:cs="Courier New"/>
-        </w:rPr>
-        <w:t>ollama</w:t>
-      </w:r>
-      <w:proofErr w:type="spellEnd"/>
-      <w:r>
-        <w:rPr>
-          <w:rFonts w:ascii="Courier New" w:hAnsi="Courier New" w:cs="Courier New"/>
-        </w:rPr>
-        <w:t xml:space="preserve"> pull qwen3.</w:t>
+      <w:r>
+        <w:rPr>
+          <w:rFonts w:ascii="Courier New" w:hAnsi="Courier New" w:cs="Courier New"/>
+        </w:rPr>
+        <w:t>ollama pull qwen3.</w:t>
       </w:r>
       <w:proofErr w:type="gramStart"/>
       <w:r>
@@ -225,107 +177,70 @@
     </w:p>
     <w:p>
       <w:pPr>
-        <w:rPr>
-          <w:b/>
-          <w:bCs/>
-        </w:rPr>
-      </w:pPr>
-      <w:r>
-        <w:rPr>
-          <w:b/>
-          <w:bCs/>
-        </w:rPr>
-        <w:t xml:space="preserve">2. Start </w:t>
-      </w:r>
-      <w:proofErr w:type="spellStart"/>
-      <w:r>
-        <w:rPr>
-          <w:b/>
-          <w:bCs/>
-        </w:rPr>
-        <w:t>ArcadeDB</w:t>
-      </w:r>
-      <w:proofErr w:type="spellEnd"/>
-      <w:r>
-        <w:rPr>
-          <w:b/>
-          <w:bCs/>
-        </w:rPr>
-        <w:t xml:space="preserve"> (Knowledge Graph)</w:t>
-      </w:r>
-    </w:p>
-    <w:p>
-      <w:pPr>
-        <w:rPr>
-          <w:b/>
-          <w:bCs/>
-        </w:rPr>
-      </w:pPr>
-      <w:r>
-        <w:rPr>
-          <w:b/>
-          <w:bCs/>
-        </w:rPr>
-        <w:t>NOT REQUIRED</w:t>
-      </w:r>
-      <w:r>
-        <w:rPr>
-          <w:b/>
-          <w:bCs/>
-        </w:rPr>
-        <w:t xml:space="preserve"> - only if you want to use knowledge bases. That is if you have tons of files / internet pages to vectorize. If it is just about drag dropping files on a canvas and vectorizing them, you do not need </w:t>
-      </w:r>
-      <w:proofErr w:type="spellStart"/>
-      <w:r>
-        <w:rPr>
-          <w:b/>
-          <w:bCs/>
-        </w:rPr>
-        <w:t>ArcadeDB</w:t>
-      </w:r>
-      <w:proofErr w:type="spellEnd"/>
-      <w:r>
-        <w:rPr>
-          <w:b/>
-          <w:bCs/>
-        </w:rPr>
-        <w:t>.</w:t>
-      </w:r>
-    </w:p>
-    <w:p>
-      <w:proofErr w:type="spellStart"/>
-      <w:r>
-        <w:t>ArcadeDB</w:t>
-      </w:r>
-      <w:proofErr w:type="spellEnd"/>
-      <w:r>
-        <w:t xml:space="preserve"> is used for the semantic relationship mapping. The easiest way to run it is via Docker.</w:t>
-      </w:r>
-    </w:p>
-    <w:p>
-      <w:pPr>
+        <w:pStyle w:val="Paragraphedeliste"/>
         <w:numPr>
           <w:ilvl w:val="0"/>
-          <w:numId w:val="2"/>
+          <w:numId w:val="3"/>
         </w:numPr>
-      </w:pPr>
-      <w:r>
-        <w:rPr>
-          <w:b/>
-          <w:bCs/>
-        </w:rPr>
-        <w:t xml:space="preserve">Download </w:t>
-      </w:r>
-      <w:proofErr w:type="spellStart"/>
-      <w:r>
-        <w:rPr>
-          <w:b/>
-          <w:bCs/>
-        </w:rPr>
-        <w:t>ArcadeDB</w:t>
-      </w:r>
-      <w:proofErr w:type="spellEnd"/>
-      <w:r>
+        <w:rPr>
+          <w:b/>
+          <w:bCs/>
+        </w:rPr>
+      </w:pPr>
+      <w:r>
+        <w:rPr>
+          <w:b/>
+          <w:bCs/>
+        </w:rPr>
+        <w:t>Start ArcadeDB (Knowledge Graph)</w:t>
+      </w:r>
+    </w:p>
+    <w:p>
+      <w:pPr>
+        <w:rPr>
+          <w:b/>
+          <w:bCs/>
+          <w:color w:val="FF0000"/>
+        </w:rPr>
+      </w:pPr>
+      <w:r>
+        <w:rPr>
+          <w:b/>
+          <w:bCs/>
+          <w:color w:val="FF0000"/>
+        </w:rPr>
+        <w:t>NOT REQUIRED - only if you want to use knowledge bases. That is if you have tons of files / internet pages to vectorize. If it is just about drag dropping files on a canvas and vectorizing them, you do not need ArcadeDB.</w:t>
+      </w:r>
+    </w:p>
+    <w:p>
+      <w:r>
+        <w:t>ArcadeDB is used for the semantic relationship mapping. The easiest way to run it is via Docker.</w:t>
+      </w:r>
+    </w:p>
+    <w:p>
+      <w:pPr>
+        <w:pStyle w:val="Paragraphedeliste"/>
+        <w:numPr>
+          <w:ilvl w:val="1"/>
+          <w:numId w:val="3"/>
+        </w:numPr>
+        <w:rPr>
+          <w:b/>
+          <w:bCs/>
+        </w:rPr>
+      </w:pPr>
+      <w:r>
+        <w:rPr>
+          <w:b/>
+          <w:bCs/>
+        </w:rPr>
+        <w:t>Download ArcadeDB</w:t>
+      </w:r>
+      <w:r>
+        <w:rPr>
+          <w:b/>
+          <w:bCs/>
+        </w:rPr>
         <w:t xml:space="preserve"> docker image </w:t>
       </w:r>
     </w:p>
@@ -351,28 +266,28 @@
     </w:p>
     <w:p>
       <w:pPr>
+        <w:pStyle w:val="Paragraphedeliste"/>
         <w:numPr>
-          <w:ilvl w:val="0"/>
-          <w:numId w:val="2"/>
+          <w:ilvl w:val="1"/>
+          <w:numId w:val="3"/>
         </w:numPr>
-      </w:pPr>
-      <w:r>
-        <w:rPr>
-          <w:b/>
-          <w:bCs/>
-        </w:rPr>
-        <w:t xml:space="preserve">Run </w:t>
-      </w:r>
-      <w:proofErr w:type="spellStart"/>
-      <w:r>
-        <w:rPr>
-          <w:b/>
-          <w:bCs/>
-        </w:rPr>
-        <w:t>ArcadeDB</w:t>
-      </w:r>
-      <w:proofErr w:type="spellEnd"/>
-      <w:r>
+        <w:rPr>
+          <w:b/>
+          <w:bCs/>
+        </w:rPr>
+      </w:pPr>
+      <w:r>
+        <w:rPr>
+          <w:b/>
+          <w:bCs/>
+        </w:rPr>
+        <w:t>Run ArcadeDB</w:t>
+      </w:r>
+      <w:r>
+        <w:rPr>
+          <w:b/>
+          <w:bCs/>
+        </w:rPr>
         <w:t>: Open your terminal and run this command:</w:t>
       </w:r>
     </w:p>
@@ -383,14 +298,12 @@
           <w:rFonts w:ascii="Courier New" w:hAnsi="Courier New" w:cs="Courier New"/>
         </w:rPr>
       </w:pPr>
-      <w:proofErr w:type="spellStart"/>
       <w:r>
         <w:rPr>
           <w:rFonts w:ascii="Courier New" w:hAnsi="Courier New" w:cs="Courier New"/>
         </w:rPr>
         <w:t>powershell</w:t>
       </w:r>
-      <w:proofErr w:type="spellEnd"/>
     </w:p>
     <w:p>
       <w:pPr>
@@ -429,21 +342,7 @@
         <w:rPr>
           <w:rFonts w:ascii="Courier New" w:hAnsi="Courier New" w:cs="Courier New"/>
         </w:rPr>
-        <w:t xml:space="preserve">  --name </w:t>
-      </w:r>
-      <w:proofErr w:type="spellStart"/>
-      <w:r>
-        <w:rPr>
-          <w:rFonts w:ascii="Courier New" w:hAnsi="Courier New" w:cs="Courier New"/>
-        </w:rPr>
-        <w:t>arcadedb</w:t>
-      </w:r>
-      <w:proofErr w:type="spellEnd"/>
-      <w:r>
-        <w:rPr>
-          <w:rFonts w:ascii="Courier New" w:hAnsi="Courier New" w:cs="Courier New"/>
-        </w:rPr>
-        <w:t xml:space="preserve"> `</w:t>
+        <w:t xml:space="preserve">  --name arcadedb `</w:t>
       </w:r>
     </w:p>
     <w:p>
@@ -483,21 +382,7 @@
         <w:rPr>
           <w:rFonts w:ascii="Courier New" w:hAnsi="Courier New" w:cs="Courier New"/>
         </w:rPr>
-        <w:t xml:space="preserve">  -e ARCADE_ROOT_PASSWORD=</w:t>
-      </w:r>
-      <w:proofErr w:type="spellStart"/>
-      <w:r>
-        <w:rPr>
-          <w:rFonts w:ascii="Courier New" w:hAnsi="Courier New" w:cs="Courier New"/>
-        </w:rPr>
-        <w:t>playwithdata</w:t>
-      </w:r>
-      <w:proofErr w:type="spellEnd"/>
-      <w:r>
-        <w:rPr>
-          <w:rFonts w:ascii="Courier New" w:hAnsi="Courier New" w:cs="Courier New"/>
-        </w:rPr>
-        <w:t xml:space="preserve"> `</w:t>
+        <w:t xml:space="preserve">  -e ARCADE_ROOT_PASSWORD=playwithdata `</w:t>
       </w:r>
     </w:p>
     <w:p>
@@ -517,23 +402,8 @@
         <w:rPr>
           <w:rFonts w:ascii="Courier New" w:hAnsi="Courier New" w:cs="Courier New"/>
         </w:rPr>
-        <w:t xml:space="preserve">  </w:t>
-      </w:r>
-      <w:proofErr w:type="spellStart"/>
-      <w:r>
-        <w:rPr>
-          <w:rFonts w:ascii="Courier New" w:hAnsi="Courier New" w:cs="Courier New"/>
-        </w:rPr>
-        <w:t>arcadedata</w:t>
-      </w:r>
-      <w:proofErr w:type="spellEnd"/>
-      <w:r>
-        <w:rPr>
-          <w:rFonts w:ascii="Courier New" w:hAnsi="Courier New" w:cs="Courier New"/>
-        </w:rPr>
-        <w:t>/</w:t>
-      </w:r>
-      <w:proofErr w:type="spellStart"/>
+        <w:t xml:space="preserve">  arcadedata/</w:t>
+      </w:r>
       <w:proofErr w:type="gramStart"/>
       <w:r>
         <w:rPr>
@@ -541,15 +411,19 @@
         </w:rPr>
         <w:t>arcadedb:latest</w:t>
       </w:r>
-      <w:proofErr w:type="spellEnd"/>
       <w:proofErr w:type="gramEnd"/>
     </w:p>
     <w:p>
       <w:pPr>
+        <w:pStyle w:val="Paragraphedeliste"/>
         <w:numPr>
-          <w:ilvl w:val="0"/>
-          <w:numId w:val="2"/>
+          <w:ilvl w:val="1"/>
+          <w:numId w:val="3"/>
         </w:numPr>
+        <w:rPr>
+          <w:b/>
+          <w:bCs/>
+        </w:rPr>
       </w:pPr>
       <w:r>
         <w:rPr>
@@ -559,17 +433,26 @@
         <w:t>Verify</w:t>
       </w:r>
       <w:r>
+        <w:rPr>
+          <w:b/>
+          <w:bCs/>
+        </w:rPr>
         <w:t>: Open </w:t>
       </w:r>
       <w:hyperlink r:id="rId6" w:history="1">
         <w:r>
           <w:rPr>
-            <w:rStyle w:val="Lienhypertexte"/>
+            <w:b/>
+            <w:bCs/>
           </w:rPr>
           <w:t>http://localhost:2480</w:t>
         </w:r>
       </w:hyperlink>
       <w:r>
+        <w:rPr>
+          <w:b/>
+          <w:bCs/>
+        </w:rPr>
         <w:t> in your browser. Login with</w:t>
       </w:r>
     </w:p>
@@ -598,82 +481,73 @@
         <w:rPr>
           <w:rFonts w:ascii="Courier New" w:hAnsi="Courier New" w:cs="Courier New"/>
         </w:rPr>
-        <w:t>oot / </w:t>
-      </w:r>
-      <w:proofErr w:type="spellStart"/>
-      <w:r>
-        <w:rPr>
-          <w:rFonts w:ascii="Courier New" w:hAnsi="Courier New" w:cs="Courier New"/>
-        </w:rPr>
-        <w:t>playwithdata</w:t>
-      </w:r>
-      <w:proofErr w:type="spellEnd"/>
-      <w:r>
-        <w:rPr>
-          <w:rFonts w:ascii="Courier New" w:hAnsi="Courier New" w:cs="Courier New"/>
-        </w:rPr>
-        <w:t>.</w:t>
+        <w:t>oot / playwithdata.</w:t>
       </w:r>
     </w:p>
     <w:p>
       <w:r>
         <w:pict w14:anchorId="2BCF3261">
-          <v:rect id="_x0000_i1037" style="width:272.3pt;height:.75pt" o:hrpct="0" o:hralign="center" o:hrstd="t" o:hr="t" fillcolor="#a0a0a0" stroked="f"/>
+          <v:rect id="_x0000_i1025" style="width:272.3pt;height:.75pt" o:hrpct="0" o:hralign="center" o:hrstd="t" o:hr="t" fillcolor="#a0a0a0" stroked="f"/>
         </w:pict>
       </w:r>
     </w:p>
     <w:p>
       <w:pPr>
-        <w:rPr>
-          <w:b/>
-          <w:bCs/>
-        </w:rPr>
-      </w:pPr>
-      <w:r>
-        <w:rPr>
-          <w:b/>
-          <w:bCs/>
-        </w:rPr>
-        <w:lastRenderedPageBreak/>
-        <w:t>3. Launch the Semantic Canvas</w:t>
-      </w:r>
-    </w:p>
-    <w:p>
-      <w:r>
-        <w:t>Once the two services above are running, you can start the main application.</w:t>
-      </w:r>
-    </w:p>
-    <w:p>
-      <w:r>
-        <w:rPr>
-          <w:b/>
-          <w:bCs/>
-        </w:rPr>
-        <w:t>Important</w:t>
-      </w:r>
-      <w:r>
-        <w:t>: Because the app is inside a Docker container, it needs to use </w:t>
-      </w:r>
-      <w:proofErr w:type="spellStart"/>
-      <w:proofErr w:type="gramStart"/>
-      <w:r>
-        <w:t>host.docker</w:t>
-      </w:r>
-      <w:proofErr w:type="gramEnd"/>
-      <w:r>
-        <w:t>.internal</w:t>
-      </w:r>
-      <w:proofErr w:type="spellEnd"/>
-      <w:r>
-        <w:t> to reach the services on your Windows host.</w:t>
-      </w:r>
-    </w:p>
-    <w:p>
-      <w:pPr>
+        <w:pStyle w:val="Paragraphedeliste"/>
         <w:numPr>
           <w:ilvl w:val="0"/>
           <w:numId w:val="3"/>
         </w:numPr>
+        <w:rPr>
+          <w:b/>
+          <w:bCs/>
+        </w:rPr>
+      </w:pPr>
+      <w:r>
+        <w:rPr>
+          <w:b/>
+          <w:bCs/>
+        </w:rPr>
+        <w:lastRenderedPageBreak/>
+        <w:t>Launch the Semantic Canvas</w:t>
+      </w:r>
+    </w:p>
+    <w:p>
+      <w:r>
+        <w:t>Once the two services above are running, you can start the main application.</w:t>
+      </w:r>
+    </w:p>
+    <w:p>
+      <w:r>
+        <w:rPr>
+          <w:b/>
+          <w:bCs/>
+        </w:rPr>
+        <w:t>Important</w:t>
+      </w:r>
+      <w:r>
+        <w:t>: Because the app is inside a Docker container, it needs to use </w:t>
+      </w:r>
+      <w:proofErr w:type="gramStart"/>
+      <w:r>
+        <w:t>host.docker</w:t>
+      </w:r>
+      <w:proofErr w:type="gramEnd"/>
+      <w:r>
+        <w:t>.internal to reach the services on your Windows host.</w:t>
+      </w:r>
+    </w:p>
+    <w:p>
+      <w:pPr>
+        <w:pStyle w:val="Paragraphedeliste"/>
+        <w:numPr>
+          <w:ilvl w:val="1"/>
+          <w:numId w:val="3"/>
+        </w:numPr>
+        <w:rPr>
+          <w:b/>
+          <w:bCs/>
+        </w:rPr>
       </w:pPr>
       <w:r>
         <w:rPr>
@@ -683,6 +557,10 @@
         <w:t>Load the image</w:t>
       </w:r>
       <w:r>
+        <w:rPr>
+          <w:b/>
+          <w:bCs/>
+        </w:rPr>
         <w:t>:</w:t>
       </w:r>
     </w:p>
@@ -692,14 +570,12 @@
           <w:rFonts w:ascii="Courier New" w:hAnsi="Courier New" w:cs="Courier New"/>
         </w:rPr>
       </w:pPr>
-      <w:proofErr w:type="spellStart"/>
       <w:r>
         <w:rPr>
           <w:rFonts w:ascii="Courier New" w:hAnsi="Courier New" w:cs="Courier New"/>
         </w:rPr>
         <w:t>powershell</w:t>
       </w:r>
-      <w:proofErr w:type="spellEnd"/>
     </w:p>
     <w:p>
       <w:pPr>
@@ -718,27 +594,14 @@
         <w:rPr>
           <w:rFonts w:ascii="Courier New" w:hAnsi="Courier New" w:cs="Courier New"/>
         </w:rPr>
-        <w:t>docker load -</w:t>
-      </w:r>
-      <w:proofErr w:type="spellStart"/>
-      <w:r>
-        <w:rPr>
-          <w:rFonts w:ascii="Courier New" w:hAnsi="Courier New" w:cs="Courier New"/>
-        </w:rPr>
-        <w:t>i</w:t>
-      </w:r>
-      <w:proofErr w:type="spellEnd"/>
-      <w:r>
-        <w:rPr>
-          <w:rFonts w:ascii="Courier New" w:hAnsi="Courier New" w:cs="Courier New"/>
-        </w:rPr>
-        <w:t xml:space="preserve"> semantic-canvas.tar</w:t>
-      </w:r>
-    </w:p>
-    <w:p>
-      <w:pPr>
+        <w:t>docker load -i semantic-canvas.tar</w:t>
+      </w:r>
+    </w:p>
+    <w:p>
+      <w:pPr>
+        <w:pStyle w:val="Paragraphedeliste"/>
         <w:numPr>
-          <w:ilvl w:val="0"/>
+          <w:ilvl w:val="1"/>
           <w:numId w:val="3"/>
         </w:numPr>
       </w:pPr>
@@ -750,31 +613,26 @@
         <w:t>Run with Environment Overrides</w:t>
       </w:r>
       <w:r>
-        <w:t>: Run the following command (or update your docker-</w:t>
-      </w:r>
-      <w:proofErr w:type="spellStart"/>
-      <w:r>
-        <w:t>compose.yml</w:t>
-      </w:r>
-      <w:proofErr w:type="spellEnd"/>
-      <w:r>
-        <w:t> environment section):</w:t>
-      </w:r>
-    </w:p>
-    <w:p>
-      <w:pPr>
-        <w:rPr>
-          <w:rFonts w:ascii="Courier New" w:hAnsi="Courier New" w:cs="Courier New"/>
-        </w:rPr>
-      </w:pPr>
-      <w:proofErr w:type="spellStart"/>
+        <w:t xml:space="preserve">: </w:t>
+      </w:r>
+    </w:p>
+    <w:p>
+      <w:r>
+        <w:t>Run the following command (or update your docker-compose.yml environment section):</w:t>
+      </w:r>
+    </w:p>
+    <w:p>
+      <w:pPr>
+        <w:rPr>
+          <w:rFonts w:ascii="Courier New" w:hAnsi="Courier New" w:cs="Courier New"/>
+        </w:rPr>
+      </w:pPr>
       <w:r>
         <w:rPr>
           <w:rFonts w:ascii="Courier New" w:hAnsi="Courier New" w:cs="Courier New"/>
         </w:rPr>
         <w:t>powershell</w:t>
       </w:r>
-      <w:proofErr w:type="spellEnd"/>
     </w:p>
     <w:p>
       <w:pPr>
@@ -890,35 +748,7 @@
         <w:rPr>
           <w:rFonts w:ascii="Courier New" w:hAnsi="Courier New" w:cs="Courier New"/>
         </w:rPr>
-        <w:t>-v ${PWD}/backend/</w:t>
-      </w:r>
-      <w:proofErr w:type="spellStart"/>
-      <w:r>
-        <w:rPr>
-          <w:rFonts w:ascii="Courier New" w:hAnsi="Courier New" w:cs="Courier New"/>
-        </w:rPr>
-        <w:t>db</w:t>
-      </w:r>
-      <w:proofErr w:type="spellEnd"/>
-      <w:r>
-        <w:rPr>
-          <w:rFonts w:ascii="Courier New" w:hAnsi="Courier New" w:cs="Courier New"/>
-        </w:rPr>
-        <w:t>:/app/backend/</w:t>
-      </w:r>
-      <w:proofErr w:type="spellStart"/>
-      <w:r>
-        <w:rPr>
-          <w:rFonts w:ascii="Courier New" w:hAnsi="Courier New" w:cs="Courier New"/>
-        </w:rPr>
-        <w:t>db</w:t>
-      </w:r>
-      <w:proofErr w:type="spellEnd"/>
-      <w:r>
-        <w:rPr>
-          <w:rFonts w:ascii="Courier New" w:hAnsi="Courier New" w:cs="Courier New"/>
-        </w:rPr>
-        <w:t xml:space="preserve"> `</w:t>
+        <w:t>-v ${PWD}/backend/db:/app/backend/db `</w:t>
       </w:r>
     </w:p>
     <w:p>
@@ -938,35 +768,7 @@
         <w:rPr>
           <w:rFonts w:ascii="Courier New" w:hAnsi="Courier New" w:cs="Courier New"/>
         </w:rPr>
-        <w:t xml:space="preserve">  -v ${PWD}/backend/</w:t>
-      </w:r>
-      <w:proofErr w:type="spellStart"/>
-      <w:r>
-        <w:rPr>
-          <w:rFonts w:ascii="Courier New" w:hAnsi="Courier New" w:cs="Courier New"/>
-        </w:rPr>
-        <w:t>chroma_db</w:t>
-      </w:r>
-      <w:proofErr w:type="spellEnd"/>
-      <w:r>
-        <w:rPr>
-          <w:rFonts w:ascii="Courier New" w:hAnsi="Courier New" w:cs="Courier New"/>
-        </w:rPr>
-        <w:t>:/app/backend/</w:t>
-      </w:r>
-      <w:proofErr w:type="spellStart"/>
-      <w:r>
-        <w:rPr>
-          <w:rFonts w:ascii="Courier New" w:hAnsi="Courier New" w:cs="Courier New"/>
-        </w:rPr>
-        <w:t>chroma_db</w:t>
-      </w:r>
-      <w:proofErr w:type="spellEnd"/>
-      <w:r>
-        <w:rPr>
-          <w:rFonts w:ascii="Courier New" w:hAnsi="Courier New" w:cs="Courier New"/>
-        </w:rPr>
-        <w:t xml:space="preserve"> `</w:t>
+        <w:t xml:space="preserve">  -v ${PWD}/backend/chroma_db:/app/backend/chroma_db `</w:t>
       </w:r>
     </w:p>
     <w:p>
@@ -986,14 +788,7 @@
         <w:rPr>
           <w:rFonts w:ascii="Courier New" w:hAnsi="Courier New" w:cs="Courier New"/>
         </w:rPr>
-        <w:t xml:space="preserve">  </w:t>
-      </w:r>
-      <w:proofErr w:type="spellStart"/>
-      <w:r>
-        <w:rPr>
-          <w:rFonts w:ascii="Courier New" w:hAnsi="Courier New" w:cs="Courier New"/>
-        </w:rPr>
-        <w:t>semantic-</w:t>
+        <w:t xml:space="preserve">  semantic-</w:t>
       </w:r>
       <w:proofErr w:type="gramStart"/>
       <w:r>
@@ -1002,7 +797,6 @@
         </w:rPr>
         <w:t>canvas:latest</w:t>
       </w:r>
-      <w:proofErr w:type="spellEnd"/>
       <w:proofErr w:type="gramEnd"/>
     </w:p>
     <w:p>
@@ -1035,7 +829,6 @@
           <w:numId w:val="4"/>
         </w:numPr>
       </w:pPr>
-      <w:proofErr w:type="spellStart"/>
       <w:r>
         <w:rPr>
           <w:b/>
@@ -1043,17 +836,8 @@
         </w:rPr>
         <w:t>Ollama</w:t>
       </w:r>
-      <w:proofErr w:type="spellEnd"/>
-      <w:r>
-        <w:t>: Installed and at least one model pulled (</w:t>
-      </w:r>
-      <w:proofErr w:type="spellStart"/>
-      <w:r>
-        <w:t>ollama</w:t>
-      </w:r>
-      <w:proofErr w:type="spellEnd"/>
-      <w:r>
-        <w:t xml:space="preserve"> pull llama3).</w:t>
+      <w:r>
+        <w:t>: Installed and at least one model pulled (ollama pull llama3).</w:t>
       </w:r>
     </w:p>
     <w:p>
@@ -1077,7 +861,7 @@
     <w:p>
       <w:r>
         <w:pict w14:anchorId="46CC84D6">
-          <v:rect id="_x0000_i1043" style="width:272.3pt;height:.75pt" o:hrpct="0" o:hralign="center" o:hrstd="t" o:hr="t" fillcolor="#a0a0a0" stroked="f"/>
+          <v:rect id="_x0000_i1034" style="width:272.3pt;height:.75pt" o:hrpct="0" o:hralign="center" o:hrstd="t" o:hr="t" fillcolor="#a0a0a0" stroked="f"/>
         </w:pict>
       </w:r>
     </w:p>
@@ -1103,23 +887,7 @@
         <w:t xml:space="preserve">If </w:t>
       </w:r>
       <w:r>
-        <w:t xml:space="preserve">you always use </w:t>
-      </w:r>
-      <w:proofErr w:type="spellStart"/>
-      <w:r>
-        <w:t>ArcadeDB</w:t>
-      </w:r>
-      <w:proofErr w:type="spellEnd"/>
-      <w:r>
-        <w:t xml:space="preserve"> and </w:t>
-      </w:r>
-      <w:proofErr w:type="spellStart"/>
-      <w:r>
-        <w:t>Ollama</w:t>
-      </w:r>
-      <w:proofErr w:type="spellEnd"/>
-      <w:r>
-        <w:t xml:space="preserve"> you can update </w:t>
+        <w:t xml:space="preserve">you always use ArcadeDB and Ollama you can update </w:t>
       </w:r>
       <w:r>
         <w:t>the </w:t>
@@ -1129,17 +897,8 @@
           <w:b/>
           <w:bCs/>
         </w:rPr>
-        <w:t>docker-</w:t>
-      </w:r>
-      <w:proofErr w:type="spellStart"/>
-      <w:r>
-        <w:rPr>
-          <w:b/>
-          <w:bCs/>
-        </w:rPr>
-        <w:t>compose.yml</w:t>
-      </w:r>
-      <w:proofErr w:type="spellEnd"/>
+        <w:t>docker-compose.yml</w:t>
+      </w:r>
       <w:r>
         <w:t> </w:t>
       </w:r>
@@ -1154,20 +913,14 @@
       <w:pPr>
         <w:rPr>
           <w:rFonts w:ascii="Courier New" w:hAnsi="Courier New" w:cs="Courier New"/>
-          <w:lang w:val="fr-FR"/>
-        </w:rPr>
-      </w:pPr>
-      <w:proofErr w:type="spellStart"/>
-      <w:proofErr w:type="gramStart"/>
-      <w:r>
-        <w:rPr>
-          <w:rFonts w:ascii="Courier New" w:hAnsi="Courier New" w:cs="Courier New"/>
-          <w:lang w:val="fr-FR"/>
+        </w:rPr>
+      </w:pPr>
+      <w:r>
+        <w:rPr>
+          <w:rFonts w:ascii="Courier New" w:hAnsi="Courier New" w:cs="Courier New"/>
         </w:rPr>
         <w:t>yaml</w:t>
       </w:r>
-      <w:proofErr w:type="spellEnd"/>
-      <w:proofErr w:type="gramEnd"/>
     </w:p>
     <w:p>
       <w:pPr>
@@ -1180,28 +933,15 @@
         <w:shd w:val="clear" w:color="auto" w:fill="E8E8E8" w:themeFill="background2"/>
         <w:rPr>
           <w:rFonts w:ascii="Courier New" w:hAnsi="Courier New" w:cs="Courier New"/>
-          <w:lang w:val="fr-FR"/>
-        </w:rPr>
-      </w:pPr>
-      <w:proofErr w:type="spellStart"/>
-      <w:proofErr w:type="gramStart"/>
-      <w:r>
-        <w:rPr>
-          <w:rFonts w:ascii="Courier New" w:hAnsi="Courier New" w:cs="Courier New"/>
-          <w:lang w:val="fr-FR"/>
+        </w:rPr>
+      </w:pPr>
+      <w:r>
+        <w:rPr>
+          <w:rFonts w:ascii="Courier New" w:hAnsi="Courier New" w:cs="Courier New"/>
         </w:rPr>
         <w:lastRenderedPageBreak/>
-        <w:t>environment</w:t>
-      </w:r>
-      <w:proofErr w:type="spellEnd"/>
-      <w:r>
-        <w:rPr>
-          <w:rFonts w:ascii="Courier New" w:hAnsi="Courier New" w:cs="Courier New"/>
-          <w:lang w:val="fr-FR"/>
-        </w:rPr>
-        <w:t>:</w:t>
-      </w:r>
-      <w:proofErr w:type="gramEnd"/>
+        <w:t>environment:</w:t>
+      </w:r>
     </w:p>
     <w:p>
       <w:pPr>
@@ -1214,13 +954,11 @@
         <w:shd w:val="clear" w:color="auto" w:fill="E8E8E8" w:themeFill="background2"/>
         <w:rPr>
           <w:rFonts w:ascii="Courier New" w:hAnsi="Courier New" w:cs="Courier New"/>
-          <w:lang w:val="fr-FR"/>
-        </w:rPr>
-      </w:pPr>
-      <w:r>
-        <w:rPr>
-          <w:rFonts w:ascii="Courier New" w:hAnsi="Courier New" w:cs="Courier New"/>
-          <w:lang w:val="fr-FR"/>
+        </w:rPr>
+      </w:pPr>
+      <w:r>
+        <w:rPr>
+          <w:rFonts w:ascii="Courier New" w:hAnsi="Courier New" w:cs="Courier New"/>
         </w:rPr>
         <w:t xml:space="preserve">      - ARCADEDB_HOST=http://host.docker.internal:2480</w:t>
       </w:r>
@@ -1236,13 +974,11 @@
         <w:shd w:val="clear" w:color="auto" w:fill="E8E8E8" w:themeFill="background2"/>
         <w:rPr>
           <w:rFonts w:ascii="Courier New" w:hAnsi="Courier New" w:cs="Courier New"/>
-          <w:lang w:val="fr-FR"/>
-        </w:rPr>
-      </w:pPr>
-      <w:r>
-        <w:rPr>
-          <w:rFonts w:ascii="Courier New" w:hAnsi="Courier New" w:cs="Courier New"/>
-          <w:lang w:val="fr-FR"/>
+        </w:rPr>
+      </w:pPr>
+      <w:r>
+        <w:rPr>
+          <w:rFonts w:ascii="Courier New" w:hAnsi="Courier New" w:cs="Courier New"/>
         </w:rPr>
         <w:t xml:space="preserve">      - OLLAMA_HOST=http://host.docker.internal:11434</w:t>
       </w:r>
@@ -1270,6 +1006,658 @@
           <w:rFonts w:ascii="Courier New" w:hAnsi="Courier New" w:cs="Courier New"/>
         </w:rPr>
         <w:t>docker-compose up -d</w:t>
+      </w:r>
+    </w:p>
+    <w:p>
+      <w:pPr>
+        <w:pStyle w:val="Paragraphedeliste"/>
+        <w:numPr>
+          <w:ilvl w:val="0"/>
+          <w:numId w:val="3"/>
+        </w:numPr>
+        <w:rPr>
+          <w:b/>
+          <w:bCs/>
+        </w:rPr>
+      </w:pPr>
+      <w:r>
+        <w:rPr>
+          <w:b/>
+          <w:bCs/>
+        </w:rPr>
+        <w:t>Configuration</w:t>
+      </w:r>
+    </w:p>
+    <w:p>
+      <w:pPr>
+        <w:pStyle w:val="Paragraphedeliste"/>
+        <w:numPr>
+          <w:ilvl w:val="1"/>
+          <w:numId w:val="3"/>
+        </w:numPr>
+        <w:rPr>
+          <w:b/>
+          <w:bCs/>
+        </w:rPr>
+      </w:pPr>
+      <w:r>
+        <w:rPr>
+          <w:b/>
+          <w:bCs/>
+        </w:rPr>
+        <w:t>Models</w:t>
+      </w:r>
+    </w:p>
+    <w:p>
+      <w:pPr>
+        <w:rPr>
+          <w:b/>
+          <w:bCs/>
+        </w:rPr>
+      </w:pPr>
+      <w:r>
+        <w:rPr>
+          <w:b/>
+          <w:bCs/>
+        </w:rPr>
+        <w:t>Sample configuration of a local (Ollama) model – Qwen 3.14</w:t>
+      </w:r>
+    </w:p>
+    <w:p>
+      <w:r>
+        <w:drawing>
+          <wp:inline distT="0" distB="0" distL="0" distR="0" wp14:anchorId="0E6B8E63" wp14:editId="1B67FE9A">
+            <wp:extent cx="5158028" cy="5800725"/>
+            <wp:effectExtent l="0" t="0" r="5080" b="0"/>
+            <wp:docPr id="2" name="Image 2"/>
+            <wp:cNvGraphicFramePr>
+              <a:graphicFrameLocks xmlns:a="http://schemas.openxmlformats.org/drawingml/2006/main" noChangeAspect="1"/>
+            </wp:cNvGraphicFramePr>
+            <a:graphic xmlns:a="http://schemas.openxmlformats.org/drawingml/2006/main">
+              <a:graphicData uri="http://schemas.openxmlformats.org/drawingml/2006/picture">
+                <pic:pic xmlns:pic="http://schemas.openxmlformats.org/drawingml/2006/picture">
+                  <pic:nvPicPr>
+                    <pic:cNvPr id="1" name=""/>
+                    <pic:cNvPicPr/>
+                  </pic:nvPicPr>
+                  <pic:blipFill>
+                    <a:blip r:embed="rId7"/>
+                    <a:stretch>
+                      <a:fillRect/>
+                    </a:stretch>
+                  </pic:blipFill>
+                  <pic:spPr>
+                    <a:xfrm>
+                      <a:off x="0" y="0"/>
+                      <a:ext cx="5165635" cy="5809280"/>
+                    </a:xfrm>
+                    <a:prstGeom prst="rect">
+                      <a:avLst/>
+                    </a:prstGeom>
+                  </pic:spPr>
+                </pic:pic>
+              </a:graphicData>
+            </a:graphic>
+          </wp:inline>
+        </w:drawing>
+      </w:r>
+    </w:p>
+    <w:p>
+      <w:pPr>
+        <w:rPr>
+          <w:b/>
+          <w:bCs/>
+        </w:rPr>
+      </w:pPr>
+    </w:p>
+    <w:p>
+      <w:pPr>
+        <w:rPr>
+          <w:b/>
+          <w:bCs/>
+        </w:rPr>
+      </w:pPr>
+      <w:r>
+        <w:rPr>
+          <w:b/>
+          <w:bCs/>
+        </w:rPr>
+        <w:t>Sample configuration of a remote (openRouter) model – GPT OSS 120</w:t>
+      </w:r>
+    </w:p>
+    <w:p>
+      <w:pPr>
+        <w:rPr>
+          <w:b/>
+          <w:bCs/>
+        </w:rPr>
+      </w:pPr>
+      <w:r>
+        <w:rPr>
+          <w:b/>
+          <w:bCs/>
+        </w:rPr>
+        <w:drawing>
+          <wp:inline distT="0" distB="0" distL="0" distR="0" wp14:anchorId="249A84E4" wp14:editId="0DBFAC17">
+            <wp:extent cx="5083018" cy="7087235"/>
+            <wp:effectExtent l="0" t="0" r="3810" b="0"/>
+            <wp:docPr id="1" name="Image 1"/>
+            <wp:cNvGraphicFramePr>
+              <a:graphicFrameLocks xmlns:a="http://schemas.openxmlformats.org/drawingml/2006/main" noChangeAspect="1"/>
+            </wp:cNvGraphicFramePr>
+            <a:graphic xmlns:a="http://schemas.openxmlformats.org/drawingml/2006/main">
+              <a:graphicData uri="http://schemas.openxmlformats.org/drawingml/2006/picture">
+                <pic:pic xmlns:pic="http://schemas.openxmlformats.org/drawingml/2006/picture">
+                  <pic:nvPicPr>
+                    <pic:cNvPr id="1" name=""/>
+                    <pic:cNvPicPr/>
+                  </pic:nvPicPr>
+                  <pic:blipFill>
+                    <a:blip r:embed="rId8"/>
+                    <a:stretch>
+                      <a:fillRect/>
+                    </a:stretch>
+                  </pic:blipFill>
+                  <pic:spPr>
+                    <a:xfrm>
+                      <a:off x="0" y="0"/>
+                      <a:ext cx="5086002" cy="7091396"/>
+                    </a:xfrm>
+                    <a:prstGeom prst="rect">
+                      <a:avLst/>
+                    </a:prstGeom>
+                  </pic:spPr>
+                </pic:pic>
+              </a:graphicData>
+            </a:graphic>
+          </wp:inline>
+        </w:drawing>
+      </w:r>
+    </w:p>
+    <w:p/>
+    <w:p>
+      <w:pPr>
+        <w:rPr>
+          <w:b/>
+          <w:bCs/>
+        </w:rPr>
+      </w:pPr>
+      <w:r>
+        <w:rPr>
+          <w:b/>
+          <w:bCs/>
+        </w:rPr>
+        <w:lastRenderedPageBreak/>
+        <w:t>Sample configuration of a local embedding model</w:t>
+      </w:r>
+    </w:p>
+    <w:p>
+      <w:r>
+        <w:drawing>
+          <wp:inline distT="0" distB="0" distL="0" distR="0" wp14:anchorId="73F7A12A" wp14:editId="7961B65F">
+            <wp:extent cx="5972810" cy="6602095"/>
+            <wp:effectExtent l="0" t="0" r="8890" b="8255"/>
+            <wp:docPr id="3" name="Image 3"/>
+            <wp:cNvGraphicFramePr>
+              <a:graphicFrameLocks xmlns:a="http://schemas.openxmlformats.org/drawingml/2006/main" noChangeAspect="1"/>
+            </wp:cNvGraphicFramePr>
+            <a:graphic xmlns:a="http://schemas.openxmlformats.org/drawingml/2006/main">
+              <a:graphicData uri="http://schemas.openxmlformats.org/drawingml/2006/picture">
+                <pic:pic xmlns:pic="http://schemas.openxmlformats.org/drawingml/2006/picture">
+                  <pic:nvPicPr>
+                    <pic:cNvPr id="1" name=""/>
+                    <pic:cNvPicPr/>
+                  </pic:nvPicPr>
+                  <pic:blipFill>
+                    <a:blip r:embed="rId9"/>
+                    <a:stretch>
+                      <a:fillRect/>
+                    </a:stretch>
+                  </pic:blipFill>
+                  <pic:spPr>
+                    <a:xfrm>
+                      <a:off x="0" y="0"/>
+                      <a:ext cx="5972810" cy="6602095"/>
+                    </a:xfrm>
+                    <a:prstGeom prst="rect">
+                      <a:avLst/>
+                    </a:prstGeom>
+                  </pic:spPr>
+                </pic:pic>
+              </a:graphicData>
+            </a:graphic>
+          </wp:inline>
+        </w:drawing>
+      </w:r>
+    </w:p>
+    <w:p>
+      <w:r>
+        <w:rPr>
+          <w:b/>
+          <w:bCs/>
+        </w:rPr>
+        <w:t>Note</w:t>
+      </w:r>
+      <w:r>
+        <w:t>: you can change the current embedding using RAG / Knowledge settings. DO NOT DO IT until you need to. The size of the vectors and the algorithms likely differ between models and it will lead to unexpected results, unless you re-vectorize all documents.</w:t>
+      </w:r>
+    </w:p>
+    <w:p>
+      <w:pPr>
+        <w:rPr>
+          <w:b/>
+          <w:bCs/>
+        </w:rPr>
+      </w:pPr>
+      <w:r>
+        <w:rPr>
+          <w:b/>
+          <w:bCs/>
+        </w:rPr>
+        <w:br w:type="page"/>
+      </w:r>
+    </w:p>
+    <w:p>
+      <w:pPr>
+        <w:rPr>
+          <w:b/>
+          <w:bCs/>
+        </w:rPr>
+      </w:pPr>
+      <w:r>
+        <w:rPr>
+          <w:b/>
+          <w:bCs/>
+        </w:rPr>
+        <w:lastRenderedPageBreak/>
+        <w:t>Sample configuration of a remote Vision model</w:t>
+      </w:r>
+    </w:p>
+    <w:p>
+      <w:r>
+        <w:drawing>
+          <wp:inline distT="0" distB="0" distL="0" distR="0" wp14:anchorId="0B596F7A" wp14:editId="63065095">
+            <wp:extent cx="4890677" cy="6629400"/>
+            <wp:effectExtent l="0" t="0" r="5715" b="0"/>
+            <wp:docPr id="4" name="Image 4"/>
+            <wp:cNvGraphicFramePr>
+              <a:graphicFrameLocks xmlns:a="http://schemas.openxmlformats.org/drawingml/2006/main" noChangeAspect="1"/>
+            </wp:cNvGraphicFramePr>
+            <a:graphic xmlns:a="http://schemas.openxmlformats.org/drawingml/2006/main">
+              <a:graphicData uri="http://schemas.openxmlformats.org/drawingml/2006/picture">
+                <pic:pic xmlns:pic="http://schemas.openxmlformats.org/drawingml/2006/picture">
+                  <pic:nvPicPr>
+                    <pic:cNvPr id="1" name=""/>
+                    <pic:cNvPicPr/>
+                  </pic:nvPicPr>
+                  <pic:blipFill>
+                    <a:blip r:embed="rId10"/>
+                    <a:stretch>
+                      <a:fillRect/>
+                    </a:stretch>
+                  </pic:blipFill>
+                  <pic:spPr>
+                    <a:xfrm>
+                      <a:off x="0" y="0"/>
+                      <a:ext cx="4898686" cy="6640256"/>
+                    </a:xfrm>
+                    <a:prstGeom prst="rect">
+                      <a:avLst/>
+                    </a:prstGeom>
+                  </pic:spPr>
+                </pic:pic>
+              </a:graphicData>
+            </a:graphic>
+          </wp:inline>
+        </w:drawing>
+      </w:r>
+    </w:p>
+    <w:p>
+      <w:pPr>
+        <w:rPr>
+          <w:b/>
+          <w:bCs/>
+        </w:rPr>
+      </w:pPr>
+      <w:r>
+        <w:rPr>
+          <w:b/>
+          <w:bCs/>
+        </w:rPr>
+        <w:br w:type="page"/>
+      </w:r>
+    </w:p>
+    <w:p>
+      <w:pPr>
+        <w:pStyle w:val="Paragraphedeliste"/>
+        <w:numPr>
+          <w:ilvl w:val="1"/>
+          <w:numId w:val="3"/>
+        </w:numPr>
+        <w:rPr>
+          <w:b/>
+          <w:bCs/>
+        </w:rPr>
+      </w:pPr>
+      <w:r>
+        <w:rPr>
+          <w:b/>
+          <w:bCs/>
+        </w:rPr>
+        <w:lastRenderedPageBreak/>
+        <w:t>local DB</w:t>
+      </w:r>
+      <w:r>
+        <w:rPr>
+          <w:b/>
+          <w:bCs/>
+        </w:rPr>
+        <w:t>s</w:t>
+      </w:r>
+      <w:r>
+        <w:rPr>
+          <w:b/>
+          <w:bCs/>
+        </w:rPr>
+        <w:t xml:space="preserve"> </w:t>
+      </w:r>
+    </w:p>
+    <w:p>
+      <w:r>
+        <w:t xml:space="preserve">Local SQL DB </w:t>
+      </w:r>
+      <w:r>
+        <w:t>(for storing configurations, metadata, etc.)</w:t>
+      </w:r>
+    </w:p>
+    <w:p>
+      <w:r>
+        <w:t>Local Graph DB (for ontologies)</w:t>
+      </w:r>
+    </w:p>
+    <w:p>
+      <w:pPr>
+        <w:rPr>
+          <w:b/>
+          <w:bCs/>
+        </w:rPr>
+      </w:pPr>
+    </w:p>
+    <w:p>
+      <w:pPr>
+        <w:rPr>
+          <w:b/>
+          <w:bCs/>
+        </w:rPr>
+      </w:pPr>
+      <w:r>
+        <w:rPr>
+          <w:b/>
+          <w:bCs/>
+        </w:rPr>
+        <w:drawing>
+          <wp:inline distT="0" distB="0" distL="0" distR="0" wp14:anchorId="4F9E782D" wp14:editId="303F74B5">
+            <wp:extent cx="5972810" cy="2990850"/>
+            <wp:effectExtent l="0" t="0" r="8890" b="0"/>
+            <wp:docPr id="5" name="Image 5"/>
+            <wp:cNvGraphicFramePr>
+              <a:graphicFrameLocks xmlns:a="http://schemas.openxmlformats.org/drawingml/2006/main" noChangeAspect="1"/>
+            </wp:cNvGraphicFramePr>
+            <a:graphic xmlns:a="http://schemas.openxmlformats.org/drawingml/2006/main">
+              <a:graphicData uri="http://schemas.openxmlformats.org/drawingml/2006/picture">
+                <pic:pic xmlns:pic="http://schemas.openxmlformats.org/drawingml/2006/picture">
+                  <pic:nvPicPr>
+                    <pic:cNvPr id="1" name=""/>
+                    <pic:cNvPicPr/>
+                  </pic:nvPicPr>
+                  <pic:blipFill>
+                    <a:blip r:embed="rId11"/>
+                    <a:stretch>
+                      <a:fillRect/>
+                    </a:stretch>
+                  </pic:blipFill>
+                  <pic:spPr>
+                    <a:xfrm>
+                      <a:off x="0" y="0"/>
+                      <a:ext cx="5972810" cy="2990850"/>
+                    </a:xfrm>
+                    <a:prstGeom prst="rect">
+                      <a:avLst/>
+                    </a:prstGeom>
+                  </pic:spPr>
+                </pic:pic>
+              </a:graphicData>
+            </a:graphic>
+          </wp:inline>
+        </w:drawing>
+      </w:r>
+    </w:p>
+    <w:p>
+      <w:pPr>
+        <w:pStyle w:val="Paragraphedeliste"/>
+        <w:numPr>
+          <w:ilvl w:val="1"/>
+          <w:numId w:val="3"/>
+        </w:numPr>
+        <w:rPr>
+          <w:b/>
+          <w:bCs/>
+        </w:rPr>
+      </w:pPr>
+      <w:r>
+        <w:rPr>
+          <w:b/>
+          <w:bCs/>
+        </w:rPr>
+        <w:t>TTS and STT</w:t>
+      </w:r>
+    </w:p>
+    <w:p>
+      <w:pPr>
+        <w:rPr>
+          <w:b/>
+          <w:bCs/>
+        </w:rPr>
+      </w:pPr>
+      <w:r>
+        <w:rPr>
+          <w:b/>
+          <w:bCs/>
+        </w:rPr>
+        <w:t>TTS and STT models are configured in the same way than other models but they have their dedicated settings.</w:t>
+      </w:r>
+    </w:p>
+    <w:p>
+      <w:pPr>
+        <w:rPr>
+          <w:b/>
+          <w:bCs/>
+        </w:rPr>
+      </w:pPr>
+      <w:r>
+        <w:rPr>
+          <w:b/>
+          <w:bCs/>
+        </w:rPr>
+        <w:drawing>
+          <wp:inline distT="0" distB="0" distL="0" distR="0" wp14:anchorId="086CD6A8" wp14:editId="25D1AEA6">
+            <wp:extent cx="5972810" cy="2954655"/>
+            <wp:effectExtent l="0" t="0" r="8890" b="0"/>
+            <wp:docPr id="6" name="Image 6"/>
+            <wp:cNvGraphicFramePr>
+              <a:graphicFrameLocks xmlns:a="http://schemas.openxmlformats.org/drawingml/2006/main" noChangeAspect="1"/>
+            </wp:cNvGraphicFramePr>
+            <a:graphic xmlns:a="http://schemas.openxmlformats.org/drawingml/2006/main">
+              <a:graphicData uri="http://schemas.openxmlformats.org/drawingml/2006/picture">
+                <pic:pic xmlns:pic="http://schemas.openxmlformats.org/drawingml/2006/picture">
+                  <pic:nvPicPr>
+                    <pic:cNvPr id="1" name=""/>
+                    <pic:cNvPicPr/>
+                  </pic:nvPicPr>
+                  <pic:blipFill>
+                    <a:blip r:embed="rId12"/>
+                    <a:stretch>
+                      <a:fillRect/>
+                    </a:stretch>
+                  </pic:blipFill>
+                  <pic:spPr>
+                    <a:xfrm>
+                      <a:off x="0" y="0"/>
+                      <a:ext cx="5972810" cy="2954655"/>
+                    </a:xfrm>
+                    <a:prstGeom prst="rect">
+                      <a:avLst/>
+                    </a:prstGeom>
+                  </pic:spPr>
+                </pic:pic>
+              </a:graphicData>
+            </a:graphic>
+          </wp:inline>
+        </w:drawing>
+      </w:r>
+    </w:p>
+    <w:p>
+      <w:pPr>
+        <w:rPr>
+          <w:b/>
+          <w:bCs/>
+        </w:rPr>
+      </w:pPr>
+      <w:r>
+        <w:rPr>
+          <w:b/>
+          <w:bCs/>
+        </w:rPr>
+        <w:lastRenderedPageBreak/>
+        <w:t>I do not recommend Whisper for STT. Slow and not so impressive after all. The local Browser STT is good and fast.</w:t>
+      </w:r>
+    </w:p>
+    <w:p>
+      <w:pPr>
+        <w:rPr>
+          <w:b/>
+          <w:bCs/>
+        </w:rPr>
+      </w:pPr>
+      <w:r>
+        <w:rPr>
+          <w:b/>
+          <w:bCs/>
+        </w:rPr>
+        <w:t>Local Browser STT config.</w:t>
+      </w:r>
+    </w:p>
+    <w:p>
+      <w:pPr>
+        <w:rPr>
+          <w:b/>
+          <w:bCs/>
+        </w:rPr>
+      </w:pPr>
+      <w:r>
+        <w:rPr>
+          <w:b/>
+          <w:bCs/>
+        </w:rPr>
+        <w:drawing>
+          <wp:inline distT="0" distB="0" distL="0" distR="0" wp14:anchorId="6247700F" wp14:editId="105322A4">
+            <wp:extent cx="5972810" cy="2781300"/>
+            <wp:effectExtent l="0" t="0" r="8890" b="0"/>
+            <wp:docPr id="8" name="Image 8"/>
+            <wp:cNvGraphicFramePr>
+              <a:graphicFrameLocks xmlns:a="http://schemas.openxmlformats.org/drawingml/2006/main" noChangeAspect="1"/>
+            </wp:cNvGraphicFramePr>
+            <a:graphic xmlns:a="http://schemas.openxmlformats.org/drawingml/2006/main">
+              <a:graphicData uri="http://schemas.openxmlformats.org/drawingml/2006/picture">
+                <pic:pic xmlns:pic="http://schemas.openxmlformats.org/drawingml/2006/picture">
+                  <pic:nvPicPr>
+                    <pic:cNvPr id="1" name=""/>
+                    <pic:cNvPicPr/>
+                  </pic:nvPicPr>
+                  <pic:blipFill>
+                    <a:blip r:embed="rId13"/>
+                    <a:stretch>
+                      <a:fillRect/>
+                    </a:stretch>
+                  </pic:blipFill>
+                  <pic:spPr>
+                    <a:xfrm>
+                      <a:off x="0" y="0"/>
+                      <a:ext cx="5972810" cy="2781300"/>
+                    </a:xfrm>
+                    <a:prstGeom prst="rect">
+                      <a:avLst/>
+                    </a:prstGeom>
+                  </pic:spPr>
+                </pic:pic>
+              </a:graphicData>
+            </a:graphic>
+          </wp:inline>
+        </w:drawing>
+      </w:r>
+    </w:p>
+    <w:p>
+      <w:pPr>
+        <w:rPr>
+          <w:b/>
+          <w:bCs/>
+        </w:rPr>
+      </w:pPr>
+      <w:r>
+        <w:rPr>
+          <w:b/>
+          <w:bCs/>
+        </w:rPr>
+        <w:t>If you really want to use Whisper, here is a sample config for a Whisper docker image:</w:t>
+      </w:r>
+    </w:p>
+    <w:p>
+      <w:pPr>
+        <w:rPr>
+          <w:b/>
+          <w:bCs/>
+        </w:rPr>
+      </w:pPr>
+      <w:r>
+        <w:rPr>
+          <w:b/>
+          <w:bCs/>
+        </w:rPr>
+        <w:drawing>
+          <wp:inline distT="0" distB="0" distL="0" distR="0" wp14:anchorId="4C09438F" wp14:editId="60A664B2">
+            <wp:extent cx="5972810" cy="3834765"/>
+            <wp:effectExtent l="0" t="0" r="8890" b="0"/>
+            <wp:docPr id="7" name="Image 7"/>
+            <wp:cNvGraphicFramePr>
+              <a:graphicFrameLocks xmlns:a="http://schemas.openxmlformats.org/drawingml/2006/main" noChangeAspect="1"/>
+            </wp:cNvGraphicFramePr>
+            <a:graphic xmlns:a="http://schemas.openxmlformats.org/drawingml/2006/main">
+              <a:graphicData uri="http://schemas.openxmlformats.org/drawingml/2006/picture">
+                <pic:pic xmlns:pic="http://schemas.openxmlformats.org/drawingml/2006/picture">
+                  <pic:nvPicPr>
+                    <pic:cNvPr id="1" name=""/>
+                    <pic:cNvPicPr/>
+                  </pic:nvPicPr>
+                  <pic:blipFill>
+                    <a:blip r:embed="rId14"/>
+                    <a:stretch>
+                      <a:fillRect/>
+                    </a:stretch>
+                  </pic:blipFill>
+                  <pic:spPr>
+                    <a:xfrm>
+                      <a:off x="0" y="0"/>
+                      <a:ext cx="5972810" cy="3834765"/>
+                    </a:xfrm>
+                    <a:prstGeom prst="rect">
+                      <a:avLst/>
+                    </a:prstGeom>
+                  </pic:spPr>
+                </pic:pic>
+              </a:graphicData>
+            </a:graphic>
+          </wp:inline>
+        </w:drawing>
       </w:r>
     </w:p>
     <w:sectPr>
@@ -1300,7 +1688,7 @@
         <w:ind w:left="720" w:hanging="360"/>
       </w:pPr>
     </w:lvl>
-    <w:lvl w:ilvl="1" w:tentative="1">
+    <w:lvl w:ilvl="1">
       <w:start w:val="1"/>
       <w:numFmt w:val="decimal"/>
       <w:lvlText w:val="%2."/>
@@ -1312,7 +1700,7 @@
         <w:ind w:left="1440" w:hanging="360"/>
       </w:pPr>
     </w:lvl>
-    <w:lvl w:ilvl="2" w:tentative="1">
+    <w:lvl w:ilvl="2">
       <w:start w:val="1"/>
       <w:numFmt w:val="decimal"/>
       <w:lvlText w:val="%3."/>
@@ -2187,6 +2575,7 @@
   <w:style w:type="paragraph" w:default="1" w:styleId="Normal">
     <w:name w:val="Normal"/>
     <w:qFormat/>
+    <w:rsid w:val="0041754C"/>
   </w:style>
   <w:style w:type="paragraph" w:styleId="Titre1">
     <w:name w:val="heading 1"/>
@@ -2390,6 +2779,7 @@
   <w:style w:type="character" w:default="1" w:styleId="Policepardfaut">
     <w:name w:val="Default Paragraph Font"/>
     <w:uiPriority w:val="1"/>
+    <w:semiHidden/>
     <w:unhideWhenUsed/>
   </w:style>
   <w:style w:type="table" w:default="1" w:styleId="TableauNormal">

</xml_diff>